<commit_message>
docs: update presentation script with interactive calendar and real-time offline sync
</commit_message>
<xml_diff>
--- a/KichBan_ThuyetMinh_Demo_StudyPlanner.docx
+++ b/KichBan_ThuyetMinh_Demo_StudyPlanner.docx
@@ -244,7 +244,7 @@
                 <w:color w:val="0F172A"/>
                 <w:sz w:val="19"/>
               </w:rPr>
-              <w:t>1923051154 (Nguyễn Thị Hương Giang)</w:t>
+              <w:t>1923050181 (Trần Bảo Trâm) — 1923051154 (Nguyễn Thị Hương Giang)</w:t>
             </w:r>
           </w:p>
         </w:tc>
@@ -1392,7 +1392,7 @@
           <w:color w:val="0E7490"/>
           <w:sz w:val="22"/>
         </w:rPr>
-        <w:t>⏱️ PHÚT 00:45 – 01:30: Trang Chủ Dashboard, Widget 48h &amp; Chuẩn Trợ Năng Accessibility</w:t>
+        <w:t>⏱️ PHÚT 00:45 – 01:30: Trang Chủ Dashboard, Widget 48h, Chuyển Đổi Sáng/Tối &amp; Trợ Năng 44x44 pt</w:t>
       </w:r>
     </w:p>
     <w:tbl>
@@ -1442,7 +1442,7 @@
                 <w:color w:val="0F172A"/>
                 <w:sz w:val="21"/>
               </w:rPr>
-              <w:t>"Em xin phép tiếp tục với màn hình Trang Chủ (Dashboard). Điểm nhấn đầu tiên chính là Widget 'Hạn nộp trong 48 giờ tới' nằm nổi bật ở trên cùng. Widget này áp dụng thuật toán lọc trượt 48h để cảnh báo sinh viên những bài cần nộp gấp nhất. Ngay bên dưới là 3 ô thống kê nhanh: Tổng bài, Số bài chưa nộp và Đã xong. Toàn bộ giao diện Home tuân thủ luật Zero-Hex 100%, tự động thích ứng mượt mà khi chuyển đổi giữa Dark Mode và Light Mode. Mọi nút bấm và ô checkbox đều đạt kích thước tối thiểu 44x44 pt theo chuẩn trợ năng quốc tế."</w:t>
+              <w:t>"Em xin phép tiếp tục với màn hình Trang Chủ (Dashboard). Điểm nhấn đầu tiên chính là Widget 'Hạn nộp trong 48 giờ tới' nằm nổi bật ở trên cùng. Widget này áp dụng thuật toán lọc trượt 48h để cảnh báo sinh viên những bài cần nộp gấp nhất. Ngay bên dưới là 3 ô thống kê nhanh: Tổng bài, Số bài chưa nộp và Đã xong. Đặc biệt, em xin bấm vào icon Mặt trăng/Mặt trời trên góc chào mừng: toàn bộ giao diện lập tức chuyển đổi mượt mà giữa Dark Mode và Light Mode, tuân thủ tuyệt đối luật Zero-Hex 100% không dùng bất kỳ mã màu cứng nào. Mọi nút bấm và ô checkbox đều đạt kích thước tối thiểu 44x44 pt theo chuẩn trợ năng quốc tế."</w:t>
               <w:br/>
             </w:r>
             <w:r>
@@ -1452,7 +1452,7 @@
                 <w:color w:val="64748B"/>
                 <w:sz w:val="19"/>
               </w:rPr>
-              <w:t>👉 Thao tác &amp; Minh họa: Trỏ vào widget 48h -&gt; Cuộn qua các thẻ thống kê -&gt; Bấm checkbox tick nhanh 1 bài tập -&gt; Thẻ gạch ngang tiêu đề ngay lập tức.</w:t>
+              <w:t>👉 Thao tác &amp; Minh họa: Bấm icon Mặt trăng/Mặt trời đổi Theme Sáng/Tối -&gt; Trỏ vào widget 48h -&gt; Cuộn qua các thẻ thống kê -&gt; Bấm checkbox tick nhanh 1 bài tập -&gt; Thẻ gạch ngang tiêu đề ngay lập tức.</w:t>
             </w:r>
           </w:p>
         </w:tc>
@@ -1477,7 +1477,7 @@
           <w:color w:val="334155"/>
           <w:sz w:val="20"/>
         </w:rPr>
-        <w:t>Dữ liệu được nạp qua hook `useAssignments()` của TanStack Query v5, kết hợp component `StateHandler` xử lý đầy đủ 4 trạng thái mạng.</w:t>
+        <w:t>Dữ liệu được nạp qua hook `useAssignments()` của TanStack Query v5, kết hợp component `StateHandler` xử lý đầy đủ 4 trạng thái mạng và lưu trữ cấu hình theme qua Zustand Store `useThemeStore`.</w:t>
       </w:r>
     </w:p>
     <w:p>
@@ -1672,7 +1672,7 @@
           <w:color w:val="0E7490"/>
           <w:sz w:val="22"/>
         </w:rPr>
-        <w:t>⏱️ PHÚT 03:00 – 03:45: Chi tiết bài tập, Chụp ảnh đính kèm &amp; Cập nhật lạc quan</w:t>
+        <w:t>⏱️ PHÚT 03:00 – 03:45: Tạo bài tập mới có ảnh, Cuốn lịch trực quan &amp; Bộ chỉnh Giờ Phút chi tiết</w:t>
       </w:r>
     </w:p>
     <w:tbl>
@@ -1722,7 +1722,7 @@
                 <w:color w:val="0F172A"/>
                 <w:sz w:val="21"/>
               </w:rPr>
-              <w:t>"Tại màn hình Chi Tiết bài tập này, sinh viên có thể xem đầy đủ Hạn nộp, Môn học, Ghi chú và đặc biệt là Ảnh chụp bảng đề bài đính kèm (sử dụng thư viện Expo Image Picker). Tại đây, khi em bấm nút 'Đánh dấu ĐÃ HOÀN THÀNH', ứng dụng áp dụng kỹ thuật Optimistic Update: giao diện đổi trạng thái ngay lập tức mà không có độ trễ mạng. Nếu có lỗi xảy ra, hệ thống sẽ tự động rollback an toàn."</w:t>
+              <w:t>"Bây giờ em xin bấm nút '➕ Tạo bài mới' trên Trang Chủ để mở màn hình Modal. Tại đây, để sinh viên có trải nghiệm chọn hạn nộp trực quan nhất, nhóm đã tự tay xây dựng một Cuốn Lịch Tháng tương tác (Interactive Calendar) bằng Pure React Native: sinh viên có thể bấm nút ◀ / ▶ để chuyển tháng, chạm chọn trực tiếp bất kỳ ngày nào trên lịch với viền highlight ngày hôm nay rất rõ ràng. Ngay bên dưới là Bộ chỉnh Giờ và Phút chi tiết: sinh viên có thể bấm nút [−] và [+] kích thước lớn chuẩn 44x44 pt để tăng giảm giờ (0-23) và phút (0-59), hoặc bấm 1 chạm vào các mốc phổ biến như 23:59 hay 17:00. Tiếp theo, em bấm nút 'Chọn ảnh đính kèm từ thư viện' để đính kèm ảnh chụp đề bài qua Expo Image Picker. Sau khi bấm 'Lưu bài tập mới', hệ thống không chỉ lưu vào cơ sở dữ liệu mà còn tự động lên lịch thông báo nhắc bài trước thời điểm nộp đúng 1 tiếng!"</w:t>
               <w:br/>
             </w:r>
             <w:r>
@@ -1732,12 +1732,34 @@
                 <w:color w:val="64748B"/>
                 <w:sz w:val="19"/>
               </w:rPr>
-              <w:t>👉 Thao tác &amp; Minh họa: Xem ảnh đính kèm đề bài -&gt; Bấm nút đánh dấu hoàn thành -&gt; Trạng thái đổi mượt mà.</w:t>
+              <w:t>👉 Thao tác &amp; Minh họa: Bấm 'Tạo bài mới' -&gt; Chuyển tháng trên Lịch -&gt; Bấm chọn ngày -&gt; Bấm nút +/- chỉnh giờ phút -&gt; Chọn ảnh từ thư viện -&gt; Bấm Lưu bài tập.</w:t>
             </w:r>
           </w:p>
         </w:tc>
       </w:tr>
     </w:tbl>
+    <w:p>
+      <w:pPr>
+        <w:spacing w:before="0" w:after="80" w:line="288" w:lineRule="auto"/>
+      </w:pPr>
+      <w:r>
+        <w:rPr>
+          <w:rFonts w:ascii="Arial" w:hAnsi="Arial"/>
+          <w:b/>
+          <w:color w:val="0F172A"/>
+          <w:sz w:val="20"/>
+        </w:rPr>
+        <w:t xml:space="preserve">Kiến trúc ngầm: </w:t>
+      </w:r>
+      <w:r>
+        <w:rPr>
+          <w:rFonts w:ascii="Arial" w:hAnsi="Arial"/>
+          <w:color w:val="334155"/>
+          <w:sz w:val="20"/>
+        </w:rPr>
+        <w:t>Modal sử dụng Pure React Native không phụ thuộc thư viện native bên ngoài, đảm bảo không bị lỗi liên kết pod trên máy chấm thi và hỗ trợ đồng bộ hoàn hảo trên cả Web, Android và iOS.</w:t>
+      </w:r>
+    </w:p>
     <w:p>
       <w:pPr>
         <w:keepNext/>
@@ -1750,7 +1772,7 @@
           <w:color w:val="0E7490"/>
           <w:sz w:val="22"/>
         </w:rPr>
-        <w:t>⏱️ PHÚT 03:45 – 04:30: Chế độ Ngoại Tuyến (Offline-First) &amp; 4 Trạng Thái Mạng</w:t>
+        <w:t>⏱️ PHÚT 03:45 – 04:30: Chế độ Ngoại Tuyến (Offline Tolerance) &amp; Đồng Bộ Thời Gian Thực</w:t>
       </w:r>
     </w:p>
     <w:tbl>
@@ -1800,7 +1822,7 @@
                 <w:color w:val="0F172A"/>
                 <w:sz w:val="21"/>
               </w:rPr>
-              <w:t>"Bây giờ em xin demo tiêu chí Must-Have #6: Khả năng chịu lỗi ngoại tuyến (Offline Tolerance). Em xin phép gạt điện thoại sang Chế độ máy bay (Airplane Mode) để ngắt hoàn toàn kết nối WiFi và 4G. Em vuốt màn hình để Refresh... Thầy có thể thấy ứng dụng không hề bị crash hay đơ màn hình! Ngay lập tức, một Banner màu vàng xuất hiện trên đầu trang: '⚠️ Đang xem dữ liệu ngoại tuyến lưu lúc 15:30'. Toàn bộ bài tập vẫn đọc và tra cứu bình thường nhờ bản snapshot lưu trong AsyncStorage. Component StateHandler của nhóm xử lý hoàn hảo cả 4 trạng thái: Loading, Empty, Error có nút Retry, và Content."</w:t>
+              <w:t>"Bây giờ em xin demo tiêu chí Must-Have #6: Khả năng chịu lỗi ngoại tuyến (Offline Tolerance). Em xin phép tắt kết nối Wi-Fi... Em vuốt nhẹ màn hình để Refresh... Thầy có thể thấy ứng dụng không hề bị crash hay đơ màn hình! Ngay lập tức, một Banner màu hổ phách xuất hiện trên đầu trang: '⚠️ Đang xem dữ liệu ngoại tuyến lưu lúc &lt;thời gian thực tế&gt;'. Toàn bộ bài tập vẫn đọc và tra cứu bình thường nhờ bản snapshot lưu trong AsyncStorage. Đặc biệt, khi em bấm tick hoàn thành một bài tập hoặc tạo bài mới lúc đang mất mạng, dữ liệu vẫn được lưu thẳng vào bộ nhớ máy và mốc thời gian trên banner tự động cập nhật theo thời gian thực tế, chứng minh dữ liệu không bị mất âm thầm đúng yêu cầu của Thầy! Khi em bật lại Wi-Fi, dải banner tự động biến mất và dữ liệu được đồng bộ lại với server."</w:t>
               <w:br/>
             </w:r>
             <w:r>
@@ -1810,7 +1832,7 @@
                 <w:color w:val="64748B"/>
                 <w:sz w:val="19"/>
               </w:rPr>
-              <w:t>👉 Thao tác &amp; Minh họa: Bật Airplane Mode -&gt; Vuốt refresh -&gt; Banner vàng xuất hiện -&gt; Các dữ liệu bài tập vẫn hiển thị nguyên vẹn.</w:t>
+              <w:t>👉 Thao tác &amp; Minh họa: Tắt Wi-Fi -&gt; Vuốt refresh -&gt; Banner hổ phách hiện kèm giờ thực tế -&gt; Tick thử bài tập -&gt; Dữ liệu lưu an toàn vào AsyncStorage.</w:t>
             </w:r>
           </w:p>
         </w:tc>
@@ -2131,6 +2153,43 @@
           <w:sz w:val="20"/>
         </w:rPr>
         <w:t>Dạ thưa Thầy: Nhóm phân chia ranh giới theo thư mục rất rõ ràng: Bạn Trâm phụ trách UI/UX, Design Tokens, Lịch tuần, và Notifications. Bạn Giang phụ trách Data Architecture, Zustand Store, SecureStore, Offline logic, và Automated Tests. Nhờ thống nhất chặt chẽ Schema dữ liệu `types/study.ts` từ đầu nên nhóm làm việc song song cực kỳ mượt mà và không hề xảy ra xung đột Git nào ạ.</w:t>
+      </w:r>
+    </w:p>
+    <w:p>
+      <w:pPr>
+        <w:keepNext/>
+        <w:spacing w:before="200" w:after="80"/>
+      </w:pPr>
+      <w:r>
+        <w:rPr>
+          <w:rFonts w:ascii="Arial" w:hAnsi="Arial"/>
+          <w:b/>
+          <w:color w:val="0E7490"/>
+          <w:sz w:val="22"/>
+        </w:rPr>
+        <w:t>Câu 7 (Hỏi TV1 &amp; TV2): Tại sao nhóm tự xây dựng cuốn lịch chọn ngày và bộ chỉnh giờ thay vì cài thư viện ngoài?</w:t>
+      </w:r>
+    </w:p>
+    <w:p>
+      <w:pPr>
+        <w:spacing w:before="0" w:after="80" w:line="288" w:lineRule="auto"/>
+      </w:pPr>
+      <w:r>
+        <w:rPr>
+          <w:rFonts w:ascii="Arial" w:hAnsi="Arial"/>
+          <w:b/>
+          <w:color w:val="0F172A"/>
+          <w:sz w:val="20"/>
+        </w:rPr>
+        <w:t xml:space="preserve">Trả lời: </w:t>
+      </w:r>
+      <w:r>
+        <w:rPr>
+          <w:rFonts w:ascii="Arial" w:hAnsi="Arial"/>
+          <w:color w:val="334155"/>
+          <w:sz w:val="20"/>
+        </w:rPr>
+        <w:t>Dạ thưa Thầy: Các thư viện datetimepicker native thường xuyên gặp lỗi liên kết pod/gradle trên máy chấm thi của Thầy hoặc lỗi hiển thị trên nền tảng Web. Nhóm đã tự tay xây dựng cuốn lịch tháng trực quan và bộ tăng giảm giờ phút bằng Pure React Native &amp; TypeScript: vừa đảm bảo 100% nút bấm đạt chuẩn trợ năng 44x44 pt của Thầy, vừa hoạt động mượt mà đồng bộ trên cả iOS, Android, Web mà không cần cài thêm bất kỳ native module nào ạ!</w:t>
       </w:r>
     </w:p>
     <w:p>

</xml_diff>